<commit_message>
Aggiunta Design Pattern: Façade
</commit_message>
<xml_diff>
--- a/designPattern/façade/Façade.docx
+++ b/designPattern/façade/Façade.docx
@@ -118,6 +118,553 @@
       </w:pPr>
       <w:r>
         <w:t>Per implementare questo pattern possiamo riutilizzare alcune nostre implementazioni precedenti per definire un sistema di piattaforma aziendale composto dai seguenti sottosistemi:</w:t>
+      </w:r>
+    </w:p>
+    <w:p>
+      <w:pPr>
+        <w:pStyle w:val="Paragrafoelenco"/>
+        <w:numPr>
+          <w:ilvl w:val="0"/>
+          <w:numId w:val="2"/>
+        </w:numPr>
+        <w:jc w:val="both"/>
+      </w:pPr>
+      <w:r>
+        <w:t>Un sistema di accesso all’azienda, implementato tramite il pattern Template Method.</w:t>
+      </w:r>
+    </w:p>
+    <w:p>
+      <w:pPr>
+        <w:pStyle w:val="Paragrafoelenco"/>
+        <w:numPr>
+          <w:ilvl w:val="0"/>
+          <w:numId w:val="2"/>
+        </w:numPr>
+        <w:jc w:val="both"/>
+      </w:pPr>
+      <w:r>
+        <w:t xml:space="preserve">Una bacheca delle lavorazioni, implementata tramite il pattern </w:t>
+      </w:r>
+      <w:proofErr w:type="spellStart"/>
+      <w:r>
+        <w:t>Command</w:t>
+      </w:r>
+      <w:proofErr w:type="spellEnd"/>
+      <w:r>
+        <w:t>.</w:t>
+      </w:r>
+    </w:p>
+    <w:p>
+      <w:pPr>
+        <w:pStyle w:val="Paragrafoelenco"/>
+        <w:numPr>
+          <w:ilvl w:val="0"/>
+          <w:numId w:val="2"/>
+        </w:numPr>
+        <w:jc w:val="both"/>
+      </w:pPr>
+      <w:r>
+        <w:t>Un quaderno di campagna che implementa il pattern Memento per la modifica del suo stesso stato.</w:t>
+      </w:r>
+    </w:p>
+    <w:p>
+      <w:pPr>
+        <w:jc w:val="both"/>
+      </w:pPr>
+      <w:r>
+        <w:t>La nostra classe Façade deve quindi dare al client una interfaccia semplice e compatta per utilizzare tutti e tre questi moduli in modo semplice, utilizzarli senza sapere di starli utilizzando. Il nostro client vuole quindi avviare un nuovo compito in modo semplice e lascia che le classi del sottosistema si occupino di tutto, in particolare dobbiamo gestire l’accesso, eseguire i compiti assegnati (lavorazioni in questo caso) ed appuntarli nel quaderno di campagna che verrà modificato se si commettono errori (funzionalità gestita dal pattern memento).</w:t>
+      </w:r>
+    </w:p>
+    <w:p>
+      <w:pPr>
+        <w:jc w:val="both"/>
+        <w:rPr>
+          <w:noProof/>
+        </w:rPr>
+      </w:pPr>
+      <w:r>
+        <w:t xml:space="preserve">La classe in questione per racchiudere il tutto e fornire </w:t>
+      </w:r>
+      <w:proofErr w:type="gramStart"/>
+      <w:r>
+        <w:t>un interfaccia</w:t>
+      </w:r>
+      <w:proofErr w:type="gramEnd"/>
+      <w:r>
+        <w:t xml:space="preserve"> semplice al cliente è il nostro Façade:</w:t>
+      </w:r>
+      <w:r>
+        <w:rPr>
+          <w:noProof/>
+        </w:rPr>
+        <w:t xml:space="preserve"> </w:t>
+      </w:r>
+      <w:r>
+        <w:rPr>
+          <w:noProof/>
+        </w:rPr>
+        <w:lastRenderedPageBreak/>
+        <w:drawing>
+          <wp:inline distT="0" distB="0" distL="0" distR="0" wp14:anchorId="78FD26EF" wp14:editId="56A8302D">
+            <wp:extent cx="6120130" cy="5258435"/>
+            <wp:effectExtent l="0" t="0" r="0" b="0"/>
+            <wp:docPr id="865024379" name="Immagine 1"/>
+            <wp:cNvGraphicFramePr>
+              <a:graphicFrameLocks xmlns:a="http://schemas.openxmlformats.org/drawingml/2006/main" noChangeAspect="1"/>
+            </wp:cNvGraphicFramePr>
+            <a:graphic xmlns:a="http://schemas.openxmlformats.org/drawingml/2006/main">
+              <a:graphicData uri="http://schemas.openxmlformats.org/drawingml/2006/picture">
+                <pic:pic xmlns:pic="http://schemas.openxmlformats.org/drawingml/2006/picture">
+                  <pic:nvPicPr>
+                    <pic:cNvPr id="865024379" name=""/>
+                    <pic:cNvPicPr/>
+                  </pic:nvPicPr>
+                  <pic:blipFill>
+                    <a:blip r:embed="rId5"/>
+                    <a:stretch>
+                      <a:fillRect/>
+                    </a:stretch>
+                  </pic:blipFill>
+                  <pic:spPr>
+                    <a:xfrm>
+                      <a:off x="0" y="0"/>
+                      <a:ext cx="6120130" cy="5258435"/>
+                    </a:xfrm>
+                    <a:prstGeom prst="rect">
+                      <a:avLst/>
+                    </a:prstGeom>
+                  </pic:spPr>
+                </pic:pic>
+              </a:graphicData>
+            </a:graphic>
+          </wp:inline>
+        </w:drawing>
+      </w:r>
+      <w:r>
+        <w:rPr>
+          <w:noProof/>
+        </w:rPr>
+        <w:t xml:space="preserve">Si nota da subito come la classe Façade chiamata in questo caso: </w:t>
+      </w:r>
+      <w:r>
+        <w:rPr>
+          <w:i/>
+          <w:iCs/>
+          <w:noProof/>
+        </w:rPr>
+        <w:t xml:space="preserve">“PiattaformaAziendaleFaçade” </w:t>
+      </w:r>
+      <w:r>
+        <w:rPr>
+          <w:noProof/>
+        </w:rPr>
+        <w:t xml:space="preserve">metta a disposizione vari metodi e coordina i sottosistemi per poi usarli per soddisfare la richiesta intrinseca del metodo, prendiamo uno per uno i metodi esposti e analizziamoli. </w:t>
+      </w:r>
+    </w:p>
+    <w:p>
+      <w:pPr>
+        <w:jc w:val="both"/>
+        <w:rPr>
+          <w:noProof/>
+        </w:rPr>
+      </w:pPr>
+      <w:r>
+        <w:rPr>
+          <w:noProof/>
+        </w:rPr>
+        <w:t xml:space="preserve">Per il metodo: </w:t>
+      </w:r>
+      <w:r>
+        <w:rPr>
+          <w:i/>
+          <w:iCs/>
+          <w:noProof/>
+        </w:rPr>
+        <w:t xml:space="preserve">“AvviaLavorazioneEstiva” </w:t>
+      </w:r>
+      <w:r>
+        <w:rPr>
+          <w:noProof/>
+        </w:rPr>
+        <w:t xml:space="preserve">vogliamo che un operaio nella nostra azienda si autentichi per farsi aprire l’accesso, questa parte viene gestita dal sottosistema </w:t>
+      </w:r>
+      <w:r>
+        <w:rPr>
+          <w:i/>
+          <w:iCs/>
+          <w:noProof/>
+        </w:rPr>
+        <w:t>GestioneAccesso</w:t>
+      </w:r>
+      <w:r>
+        <w:rPr>
+          <w:noProof/>
+        </w:rPr>
+        <w:t xml:space="preserve"> implementato precedentemente con il design pattern Template Method</w:t>
+      </w:r>
+      <w:r>
+        <w:rPr>
+          <w:noProof/>
+        </w:rPr>
+        <w:t>.</w:t>
+      </w:r>
+      <w:r>
+        <w:rPr>
+          <w:noProof/>
+        </w:rPr>
+        <w:t xml:space="preserve"> </w:t>
+      </w:r>
+      <w:r>
+        <w:rPr>
+          <w:noProof/>
+        </w:rPr>
+        <w:t xml:space="preserve">Dopodiché </w:t>
+      </w:r>
+      <w:r>
+        <w:rPr>
+          <w:noProof/>
+        </w:rPr>
+        <w:t>gli diamo le operazioni da svolger</w:t>
+      </w:r>
+      <w:r>
+        <w:rPr>
+          <w:noProof/>
+        </w:rPr>
+        <w:t xml:space="preserve">e, in questo caso </w:t>
+      </w:r>
+      <w:r>
+        <w:rPr>
+          <w:i/>
+          <w:iCs/>
+          <w:noProof/>
+        </w:rPr>
+        <w:t xml:space="preserve">Aratura </w:t>
+      </w:r>
+      <w:r>
+        <w:rPr>
+          <w:noProof/>
+        </w:rPr>
+        <w:t xml:space="preserve">e </w:t>
+      </w:r>
+      <w:r>
+        <w:rPr>
+          <w:i/>
+          <w:iCs/>
+          <w:noProof/>
+        </w:rPr>
+        <w:t xml:space="preserve">Irrigazione, </w:t>
+      </w:r>
+      <w:r>
+        <w:rPr>
+          <w:noProof/>
+        </w:rPr>
+        <w:t xml:space="preserve">eseguite con l’implementazione vista per il pattern Command e soltatnto alla fine scriviamo cosa abbiamo fatto nel nostro </w:t>
+      </w:r>
+      <w:r>
+        <w:rPr>
+          <w:i/>
+          <w:iCs/>
+          <w:noProof/>
+        </w:rPr>
+        <w:t xml:space="preserve">“quadernoDiCampagna” </w:t>
+      </w:r>
+      <w:r>
+        <w:rPr>
+          <w:noProof/>
+        </w:rPr>
+        <w:t xml:space="preserve">di tipo </w:t>
+      </w:r>
+      <w:r>
+        <w:rPr>
+          <w:i/>
+          <w:iCs/>
+          <w:noProof/>
+        </w:rPr>
+        <w:t>Messaggio</w:t>
+      </w:r>
+      <w:r>
+        <w:rPr>
+          <w:noProof/>
+        </w:rPr>
+        <w:t xml:space="preserve"> con l’implementazione vista per il memento. </w:t>
+      </w:r>
+    </w:p>
+    <w:p>
+      <w:pPr>
+        <w:jc w:val="both"/>
+      </w:pPr>
+      <w:r>
+        <w:rPr>
+          <w:noProof/>
+        </w:rPr>
+        <w:t xml:space="preserve">Il metodo </w:t>
+      </w:r>
+      <w:r>
+        <w:rPr>
+          <w:i/>
+          <w:iCs/>
+          <w:noProof/>
+        </w:rPr>
+        <w:t xml:space="preserve">lavorazioniSvolte </w:t>
+      </w:r>
+      <w:r>
+        <w:rPr>
+          <w:noProof/>
+        </w:rPr>
+        <w:t xml:space="preserve">è banale, restituisce il toString del </w:t>
+      </w:r>
+      <w:r>
+        <w:rPr>
+          <w:i/>
+          <w:iCs/>
+          <w:noProof/>
+        </w:rPr>
+        <w:t xml:space="preserve">quadernoDiCampagna </w:t>
+      </w:r>
+      <w:r>
+        <w:rPr>
+          <w:noProof/>
+        </w:rPr>
+        <w:t xml:space="preserve">per avere la lista dei compiti svolti infine, il metodo </w:t>
+      </w:r>
+      <w:r>
+        <w:rPr>
+          <w:i/>
+          <w:iCs/>
+          <w:noProof/>
+        </w:rPr>
+        <w:t>eliminaLavorazione</w:t>
+      </w:r>
+      <w:r>
+        <w:t xml:space="preserve"> riporta l’oggetto </w:t>
+      </w:r>
+      <w:r>
+        <w:rPr>
+          <w:i/>
+          <w:iCs/>
+        </w:rPr>
+        <w:t xml:space="preserve">quadernoDiCampagna </w:t>
+      </w:r>
+      <w:r>
+        <w:t>ad un suo stato precedente, cioè “</w:t>
+      </w:r>
+      <w:r>
+        <w:t>dimentica</w:t>
+      </w:r>
+      <w:r>
+        <w:t>” l’ultima lavorazione aggiunta.</w:t>
+      </w:r>
+    </w:p>
+    <w:p>
+      <w:r>
+        <w:br w:type="page"/>
+      </w:r>
+    </w:p>
+    <w:p>
+      <w:pPr>
+        <w:jc w:val="both"/>
+      </w:pPr>
+      <w:r>
+        <w:lastRenderedPageBreak/>
+        <w:t xml:space="preserve">Il Façade quindi può creare, convertire, recuperare da repository gli oggetti e usare parametri diversi per ogni metodo. Questo </w:t>
+      </w:r>
+      <w:r>
+        <w:t xml:space="preserve">particolare, </w:t>
+      </w:r>
+      <w:r>
+        <w:t>ci</w:t>
+      </w:r>
+      <w:r>
+        <w:t xml:space="preserve"> aiuta a semplificare in maniera massiccia il codice per il nostro client, il tutto si riduce a</w:t>
+      </w:r>
+      <w:r>
+        <w:rPr>
+          <w:noProof/>
+        </w:rPr>
+        <w:drawing>
+          <wp:anchor distT="0" distB="0" distL="114300" distR="114300" simplePos="0" relativeHeight="251658240" behindDoc="0" locked="0" layoutInCell="1" allowOverlap="1" wp14:anchorId="2A22173F" wp14:editId="0D34FCC2">
+            <wp:simplePos x="0" y="0"/>
+            <wp:positionH relativeFrom="column">
+              <wp:posOffset>-2034</wp:posOffset>
+            </wp:positionH>
+            <wp:positionV relativeFrom="page">
+              <wp:posOffset>1452942</wp:posOffset>
+            </wp:positionV>
+            <wp:extent cx="6120130" cy="2171065"/>
+            <wp:effectExtent l="0" t="0" r="0" b="635"/>
+            <wp:wrapTopAndBottom/>
+            <wp:docPr id="495838109" name="Immagine 1"/>
+            <wp:cNvGraphicFramePr>
+              <a:graphicFrameLocks xmlns:a="http://schemas.openxmlformats.org/drawingml/2006/main" noChangeAspect="1"/>
+            </wp:cNvGraphicFramePr>
+            <a:graphic xmlns:a="http://schemas.openxmlformats.org/drawingml/2006/main">
+              <a:graphicData uri="http://schemas.openxmlformats.org/drawingml/2006/picture">
+                <pic:pic xmlns:pic="http://schemas.openxmlformats.org/drawingml/2006/picture">
+                  <pic:nvPicPr>
+                    <pic:cNvPr id="495838109" name=""/>
+                    <pic:cNvPicPr/>
+                  </pic:nvPicPr>
+                  <pic:blipFill>
+                    <a:blip r:embed="rId6" cstate="print">
+                      <a:extLst>
+                        <a:ext uri="{28A0092B-C50C-407E-A947-70E740481C1C}">
+                          <a14:useLocalDpi xmlns:a14="http://schemas.microsoft.com/office/drawing/2010/main" val="0"/>
+                        </a:ext>
+                      </a:extLst>
+                    </a:blip>
+                    <a:stretch>
+                      <a:fillRect/>
+                    </a:stretch>
+                  </pic:blipFill>
+                  <pic:spPr>
+                    <a:xfrm>
+                      <a:off x="0" y="0"/>
+                      <a:ext cx="6120130" cy="2171065"/>
+                    </a:xfrm>
+                    <a:prstGeom prst="rect">
+                      <a:avLst/>
+                    </a:prstGeom>
+                  </pic:spPr>
+                </pic:pic>
+              </a:graphicData>
+            </a:graphic>
+          </wp:anchor>
+        </w:drawing>
+      </w:r>
+      <w:r>
+        <w:t>:</w:t>
+      </w:r>
+    </w:p>
+    <w:p>
+      <w:pPr>
+        <w:jc w:val="both"/>
+      </w:pPr>
+      <w:r>
+        <w:t>Come possiamo notare il client usa solo il Façade e non sa cosa sta succedendo dietro le quinte, la creazione degli oggetti e di come lavorano i vari pattern dietro.</w:t>
+      </w:r>
+    </w:p>
+    <w:p>
+      <w:pPr>
+        <w:jc w:val="both"/>
+      </w:pPr>
+      <w:r>
+        <w:t>Il diagramma UML può essere diviso in due, il diagramma semplice:</w:t>
+      </w:r>
+    </w:p>
+    <w:p>
+      <w:pPr>
+        <w:jc w:val="both"/>
+      </w:pPr>
+      <w:r>
+        <w:rPr>
+          <w:noProof/>
+        </w:rPr>
+        <w:drawing>
+          <wp:inline distT="0" distB="0" distL="0" distR="0" wp14:anchorId="07DC933F" wp14:editId="416AEF2F">
+            <wp:extent cx="6120130" cy="3598545"/>
+            <wp:effectExtent l="0" t="0" r="0" b="1905"/>
+            <wp:docPr id="1965822391" name="Immagine 1"/>
+            <wp:cNvGraphicFramePr>
+              <a:graphicFrameLocks xmlns:a="http://schemas.openxmlformats.org/drawingml/2006/main" noChangeAspect="1"/>
+            </wp:cNvGraphicFramePr>
+            <a:graphic xmlns:a="http://schemas.openxmlformats.org/drawingml/2006/main">
+              <a:graphicData uri="http://schemas.openxmlformats.org/drawingml/2006/picture">
+                <pic:pic xmlns:pic="http://schemas.openxmlformats.org/drawingml/2006/picture">
+                  <pic:nvPicPr>
+                    <pic:cNvPr id="1965822391" name="Immagine 1965822391"/>
+                    <pic:cNvPicPr/>
+                  </pic:nvPicPr>
+                  <pic:blipFill>
+                    <a:blip r:embed="rId7">
+                      <a:extLst>
+                        <a:ext uri="{28A0092B-C50C-407E-A947-70E740481C1C}">
+                          <a14:useLocalDpi xmlns:a14="http://schemas.microsoft.com/office/drawing/2010/main" val="0"/>
+                        </a:ext>
+                      </a:extLst>
+                    </a:blip>
+                    <a:stretch>
+                      <a:fillRect/>
+                    </a:stretch>
+                  </pic:blipFill>
+                  <pic:spPr>
+                    <a:xfrm>
+                      <a:off x="0" y="0"/>
+                      <a:ext cx="6120130" cy="3598545"/>
+                    </a:xfrm>
+                    <a:prstGeom prst="rect">
+                      <a:avLst/>
+                    </a:prstGeom>
+                  </pic:spPr>
+                </pic:pic>
+              </a:graphicData>
+            </a:graphic>
+          </wp:inline>
+        </w:drawing>
+      </w:r>
+    </w:p>
+    <w:p>
+      <w:r>
+        <w:br w:type="page"/>
+      </w:r>
+    </w:p>
+    <w:p>
+      <w:pPr>
+        <w:jc w:val="both"/>
+      </w:pPr>
+      <w:r>
+        <w:lastRenderedPageBreak/>
+        <w:t>E in un diagramma un po’ più esplicativo ma complesso:</w:t>
+      </w:r>
+    </w:p>
+    <w:p>
+      <w:pPr>
+        <w:jc w:val="both"/>
+      </w:pPr>
+      <w:r>
+        <w:rPr>
+          <w:noProof/>
+        </w:rPr>
+        <w:drawing>
+          <wp:inline distT="0" distB="0" distL="0" distR="0" wp14:anchorId="43DAED20" wp14:editId="6933A3D4">
+            <wp:extent cx="6114306" cy="2236231"/>
+            <wp:effectExtent l="0" t="0" r="1270" b="0"/>
+            <wp:docPr id="273082386" name="Immagine 2"/>
+            <wp:cNvGraphicFramePr>
+              <a:graphicFrameLocks xmlns:a="http://schemas.openxmlformats.org/drawingml/2006/main" noChangeAspect="1"/>
+            </wp:cNvGraphicFramePr>
+            <a:graphic xmlns:a="http://schemas.openxmlformats.org/drawingml/2006/main">
+              <a:graphicData uri="http://schemas.openxmlformats.org/drawingml/2006/picture">
+                <pic:pic xmlns:pic="http://schemas.openxmlformats.org/drawingml/2006/picture">
+                  <pic:nvPicPr>
+                    <pic:cNvPr id="273082386" name="Immagine 273082386"/>
+                    <pic:cNvPicPr/>
+                  </pic:nvPicPr>
+                  <pic:blipFill>
+                    <a:blip r:embed="rId8" cstate="print">
+                      <a:extLst>
+                        <a:ext uri="{28A0092B-C50C-407E-A947-70E740481C1C}">
+                          <a14:useLocalDpi xmlns:a14="http://schemas.microsoft.com/office/drawing/2010/main" val="0"/>
+                        </a:ext>
+                      </a:extLst>
+                    </a:blip>
+                    <a:stretch>
+                      <a:fillRect/>
+                    </a:stretch>
+                  </pic:blipFill>
+                  <pic:spPr>
+                    <a:xfrm>
+                      <a:off x="0" y="0"/>
+                      <a:ext cx="6114306" cy="2236231"/>
+                    </a:xfrm>
+                    <a:prstGeom prst="rect">
+                      <a:avLst/>
+                    </a:prstGeom>
+                  </pic:spPr>
+                </pic:pic>
+              </a:graphicData>
+            </a:graphic>
+          </wp:inline>
+        </w:drawing>
       </w:r>
     </w:p>
     <w:sectPr>
@@ -218,8 +765,97 @@
       </w:pPr>
     </w:lvl>
   </w:abstractNum>
+  <w:abstractNum w:abstractNumId="1" w15:restartNumberingAfterBreak="0">
+    <w:nsid w:val="7BEA0190"/>
+    <w:multiLevelType w:val="hybridMultilevel"/>
+    <w:tmpl w:val="382AF7B0"/>
+    <w:lvl w:ilvl="0" w:tplc="04100011">
+      <w:start w:val="1"/>
+      <w:numFmt w:val="decimal"/>
+      <w:lvlText w:val="%1)"/>
+      <w:lvlJc w:val="left"/>
+      <w:pPr>
+        <w:ind w:left="720" w:hanging="360"/>
+      </w:pPr>
+    </w:lvl>
+    <w:lvl w:ilvl="1" w:tplc="04100019" w:tentative="1">
+      <w:start w:val="1"/>
+      <w:numFmt w:val="lowerLetter"/>
+      <w:lvlText w:val="%2."/>
+      <w:lvlJc w:val="left"/>
+      <w:pPr>
+        <w:ind w:left="1440" w:hanging="360"/>
+      </w:pPr>
+    </w:lvl>
+    <w:lvl w:ilvl="2" w:tplc="0410001B" w:tentative="1">
+      <w:start w:val="1"/>
+      <w:numFmt w:val="lowerRoman"/>
+      <w:lvlText w:val="%3."/>
+      <w:lvlJc w:val="right"/>
+      <w:pPr>
+        <w:ind w:left="2160" w:hanging="180"/>
+      </w:pPr>
+    </w:lvl>
+    <w:lvl w:ilvl="3" w:tplc="0410000F" w:tentative="1">
+      <w:start w:val="1"/>
+      <w:numFmt w:val="decimal"/>
+      <w:lvlText w:val="%4."/>
+      <w:lvlJc w:val="left"/>
+      <w:pPr>
+        <w:ind w:left="2880" w:hanging="360"/>
+      </w:pPr>
+    </w:lvl>
+    <w:lvl w:ilvl="4" w:tplc="04100019" w:tentative="1">
+      <w:start w:val="1"/>
+      <w:numFmt w:val="lowerLetter"/>
+      <w:lvlText w:val="%5."/>
+      <w:lvlJc w:val="left"/>
+      <w:pPr>
+        <w:ind w:left="3600" w:hanging="360"/>
+      </w:pPr>
+    </w:lvl>
+    <w:lvl w:ilvl="5" w:tplc="0410001B" w:tentative="1">
+      <w:start w:val="1"/>
+      <w:numFmt w:val="lowerRoman"/>
+      <w:lvlText w:val="%6."/>
+      <w:lvlJc w:val="right"/>
+      <w:pPr>
+        <w:ind w:left="4320" w:hanging="180"/>
+      </w:pPr>
+    </w:lvl>
+    <w:lvl w:ilvl="6" w:tplc="0410000F" w:tentative="1">
+      <w:start w:val="1"/>
+      <w:numFmt w:val="decimal"/>
+      <w:lvlText w:val="%7."/>
+      <w:lvlJc w:val="left"/>
+      <w:pPr>
+        <w:ind w:left="5040" w:hanging="360"/>
+      </w:pPr>
+    </w:lvl>
+    <w:lvl w:ilvl="7" w:tplc="04100019" w:tentative="1">
+      <w:start w:val="1"/>
+      <w:numFmt w:val="lowerLetter"/>
+      <w:lvlText w:val="%8."/>
+      <w:lvlJc w:val="left"/>
+      <w:pPr>
+        <w:ind w:left="5760" w:hanging="360"/>
+      </w:pPr>
+    </w:lvl>
+    <w:lvl w:ilvl="8" w:tplc="0410001B" w:tentative="1">
+      <w:start w:val="1"/>
+      <w:numFmt w:val="lowerRoman"/>
+      <w:lvlText w:val="%9."/>
+      <w:lvlJc w:val="right"/>
+      <w:pPr>
+        <w:ind w:left="6480" w:hanging="180"/>
+      </w:pPr>
+    </w:lvl>
+  </w:abstractNum>
   <w:num w:numId="1" w16cid:durableId="84542747">
     <w:abstractNumId w:val="0"/>
+  </w:num>
+  <w:num w:numId="2" w16cid:durableId="1304582726">
+    <w:abstractNumId w:val="1"/>
   </w:num>
 </w:numbering>
 </file>
@@ -827,7 +1463,6 @@
   <w:style w:type="character" w:default="1" w:styleId="Carpredefinitoparagrafo">
     <w:name w:val="Default Paragraph Font"/>
     <w:uiPriority w:val="1"/>
-    <w:semiHidden/>
     <w:unhideWhenUsed/>
   </w:style>
   <w:style w:type="table" w:default="1" w:styleId="Tabellanormale">

</xml_diff>